<commit_message>
Resume: dedupe 400% bullet + replace jeffaragon.com with new GitHub Pages URL
</commit_message>
<xml_diff>
--- a/resume/Jeff_Aragon_Resume_Fractional.docx
+++ b/resume/Jeff_Aragon_Resume_Fractional.docx
@@ -696,13 +696,6 @@
           <w:bCs/>
         </w:rPr>
       </w:pPr>
-      <w:r>
-        <w:rPr>
-          <w:b/>
-          <w:bCs/>
-        </w:rPr>
-        <w:t>400% of quota attained in first fiscal year.</w:t>
-      </w:r>
     </w:p>
     <w:p>
       <w:pPr>

</xml_diff>

<commit_message>
Resume: remove orphan empty bullet left after standalone-400 deletion
</commit_message>
<xml_diff>
--- a/resume/Jeff_Aragon_Resume_Fractional.docx
+++ b/resume/Jeff_Aragon_Resume_Fractional.docx
@@ -691,19 +691,6 @@
           <w:ilvl w:val="0"/>
           <w:numId w:val="4"/>
         </w:numPr>
-        <w:rPr>
-          <w:b/>
-          <w:bCs/>
-        </w:rPr>
-      </w:pPr>
-    </w:p>
-    <w:p>
-      <w:pPr>
-        <w:pStyle w:val="Compact"/>
-        <w:numPr>
-          <w:ilvl w:val="0"/>
-          <w:numId w:val="4"/>
-        </w:numPr>
       </w:pPr>
       <w:r>
         <w:rPr>

</xml_diff>

<commit_message>
Resume: strip 4 remaining em-dashes (QA finding)
</commit_message>
<xml_diff>
--- a/resume/Jeff_Aragon_Resume_Fractional.docx
+++ b/resume/Jeff_Aragon_Resume_Fractional.docx
@@ -905,7 +905,13 @@
         <w:t>AI</w:t>
       </w:r>
       <w:r>
-        <w:t xml:space="preserve"> — AI-powered patient and member experience platform (Ushur). AI/ML SaaS go-to-market across multiple verticals.</w:t>
+        <w:t xml:space="preserve"> </w:t>
+      </w:r>
+      <w:r>
+        <w:t xml:space="preserve">, </w:t>
+      </w:r>
+      <w:r>
+        <w:t xml:space="preserve"> AI-powered patient and member experience platform (Ushur). AI/ML SaaS go-to-market across multiple verticals.</w:t>
       </w:r>
     </w:p>
     <w:p>
@@ -924,7 +930,13 @@
         <w:t>Data and analytics</w:t>
       </w:r>
       <w:r>
-        <w:t xml:space="preserve"> — Healthcare data and analytics platform (Insightin Health). Workforce analytics (UKG).</w:t>
+        <w:t xml:space="preserve"> </w:t>
+      </w:r>
+      <w:r>
+        <w:t xml:space="preserve">, </w:t>
+      </w:r>
+      <w:r>
+        <w:t xml:space="preserve"> Healthcare data and analytics platform (Insightin Health). Workforce analytics (UKG).</w:t>
       </w:r>
     </w:p>
     <w:p>
@@ -943,7 +955,13 @@
         <w:t>Observability</w:t>
       </w:r>
       <w:r>
-        <w:t xml:space="preserve"> — Enterprise network observability and security (AT&amp;T Data Networking, 5 years global WAN sales to Fortune 50 buyers).</w:t>
+        <w:t xml:space="preserve"> </w:t>
+      </w:r>
+      <w:r>
+        <w:t xml:space="preserve">, </w:t>
+      </w:r>
+      <w:r>
+        <w:t xml:space="preserve"> Enterprise network observability and security (AT&amp;T Data Networking, 5 years global WAN sales to Fortune 50 buyers).</w:t>
       </w:r>
     </w:p>
     <w:p>
@@ -962,7 +980,13 @@
         <w:t>Operations intelligence (your category)</w:t>
       </w:r>
       <w:r>
-        <w:t xml:space="preserve"> — Workforce operations intelligence (UKG: labor productivity, scheduling, compliance). Multi-stakeholder enterprise operations buying centers (Operations, IT, Finance, CFO economic owners).</w:t>
+        <w:t xml:space="preserve"> </w:t>
+      </w:r>
+      <w:r>
+        <w:t xml:space="preserve">, </w:t>
+      </w:r>
+      <w:r>
+        <w:t xml:space="preserve"> Workforce operations intelligence (UKG: labor productivity, scheduling, compliance). Multi-stakeholder enterprise operations buying centers (Operations, IT, Finance, CFO economic owners).</w:t>
       </w:r>
     </w:p>
     <w:p>

</xml_diff>